<commit_message>
feat: migrate all 21 template masters from literal old text to {{TOKEN}} placeholders
</commit_message>
<xml_diff>
--- a/01. Hồ sơ đạo đức đề cương - MẪU/00. QĐ Giao đề tài.docx
+++ b/01. Hồ sơ đạo đức đề cương - MẪU/00. QĐ Giao đề tài.docx
@@ -186,7 +186,7 @@
                 <w:sz w:val="24"/>
                 <w:szCs w:val="24"/>
               </w:rPr>
-              <w:t xml:space="preserve">Số: </w:t>
+              <w:t>Số:     /QĐ-YHUD/{{NAM}}</w:t>
             </w:r>
             <w:r>
               <w:rPr>
@@ -194,14 +194,12 @@
                 <w:szCs w:val="24"/>
                 <w:lang w:val="vi-VN"/>
               </w:rPr>
-              <w:t xml:space="preserve">   </w:t>
             </w:r>
             <w:r>
               <w:rPr>
                 <w:sz w:val="24"/>
                 <w:szCs w:val="24"/>
               </w:rPr>
-              <w:t xml:space="preserve"> /QĐ-YHUD/2024</w:t>
             </w:r>
           </w:p>
         </w:tc>
@@ -383,7 +381,7 @@
                 <w:sz w:val="24"/>
                 <w:szCs w:val="24"/>
               </w:rPr>
-              <w:t>Hà Nội, ngày</w:t>
+              <w:t>Hà Nội, ngày      tháng      năm {{NAM}}</w:t>
             </w:r>
             <w:r>
               <w:rPr>
@@ -392,7 +390,6 @@
                 <w:szCs w:val="24"/>
                 <w:lang w:val="vi-VN"/>
               </w:rPr>
-              <w:t xml:space="preserve">     </w:t>
             </w:r>
             <w:r>
               <w:rPr>
@@ -400,7 +397,6 @@
                 <w:sz w:val="24"/>
                 <w:szCs w:val="24"/>
               </w:rPr>
-              <w:t xml:space="preserve"> tháng </w:t>
             </w:r>
             <w:r>
               <w:rPr>
@@ -409,7 +405,6 @@
                 <w:szCs w:val="24"/>
                 <w:lang w:val="vi-VN"/>
               </w:rPr>
-              <w:t xml:space="preserve">     </w:t>
             </w:r>
             <w:r>
               <w:rPr>
@@ -417,7 +412,6 @@
                 <w:sz w:val="24"/>
                 <w:szCs w:val="24"/>
               </w:rPr>
-              <w:t>năm 2024</w:t>
             </w:r>
           </w:p>
         </w:tc>
@@ -463,63 +457,55 @@
           <w:i/>
           <w:lang w:val="vi-VN"/>
         </w:rPr>
-        <w:t>V</w:t>
-      </w:r>
-      <w:r>
-        <w:rPr>
-          <w:i/>
-          <w:lang w:val="vi-VN"/>
-        </w:rPr>
-        <w:t>/v</w:t>
-      </w:r>
-      <w:r>
-        <w:rPr>
-          <w:i/>
-          <w:lang w:val="vi-VN"/>
-        </w:rPr>
-        <w:t xml:space="preserve">: </w:t>
-      </w:r>
-      <w:r>
-        <w:rPr>
-          <w:i/>
-          <w:lang w:val="vi-VN"/>
-        </w:rPr>
-        <w:t xml:space="preserve">Giao </w:t>
-      </w:r>
-      <w:r>
-        <w:rPr>
-          <w:i/>
-          <w:lang w:val="vi-VN"/>
-        </w:rPr>
-        <w:t xml:space="preserve">đề tài </w:t>
-      </w:r>
-      <w:r>
-        <w:rPr>
-          <w:i/>
-          <w:lang w:val="vi-VN"/>
-        </w:rPr>
-        <w:t xml:space="preserve">Khoa học công nghệ </w:t>
-      </w:r>
-      <w:r>
-        <w:rPr>
-          <w:i/>
-          <w:lang w:val="vi-VN"/>
-        </w:rPr>
-        <w:t>năm</w:t>
-      </w:r>
-      <w:r>
-        <w:rPr>
-          <w:i/>
-          <w:lang w:val="vi-VN"/>
-        </w:rPr>
-        <w:t xml:space="preserve"> </w:t>
-      </w:r>
-      <w:r>
-        <w:rPr>
-          <w:i/>
-          <w:lang w:val="vi-VN"/>
-        </w:rPr>
-        <w:t>2024</w:t>
+        <w:t>V/v: Giao đề tài Khoa học công nghệ năm {{NAM}}</w:t>
+      </w:r>
+      <w:r>
+        <w:rPr>
+          <w:i/>
+          <w:lang w:val="vi-VN"/>
+        </w:rPr>
+      </w:r>
+      <w:r>
+        <w:rPr>
+          <w:i/>
+          <w:lang w:val="vi-VN"/>
+        </w:rPr>
+      </w:r>
+      <w:r>
+        <w:rPr>
+          <w:i/>
+          <w:lang w:val="vi-VN"/>
+        </w:rPr>
+      </w:r>
+      <w:r>
+        <w:rPr>
+          <w:i/>
+          <w:lang w:val="vi-VN"/>
+        </w:rPr>
+      </w:r>
+      <w:r>
+        <w:rPr>
+          <w:i/>
+          <w:lang w:val="vi-VN"/>
+        </w:rPr>
+      </w:r>
+      <w:r>
+        <w:rPr>
+          <w:i/>
+          <w:lang w:val="vi-VN"/>
+        </w:rPr>
+      </w:r>
+      <w:r>
+        <w:rPr>
+          <w:i/>
+          <w:lang w:val="vi-VN"/>
+        </w:rPr>
+      </w:r>
+      <w:r>
+        <w:rPr>
+          <w:i/>
+          <w:lang w:val="vi-VN"/>
+        </w:rPr>
       </w:r>
     </w:p>
     <w:p>
@@ -757,158 +743,135 @@
           <w:b/>
           <w:lang w:val="vi-VN"/>
         </w:rPr>
-        <w:t>Điều 1</w:t>
-      </w:r>
-      <w:r>
-        <w:rPr>
-          <w:lang w:val="vi-VN"/>
-        </w:rPr>
-        <w:t xml:space="preserve">: </w:t>
-      </w:r>
-      <w:r>
-        <w:rPr>
-          <w:lang w:val="vi-VN"/>
-        </w:rPr>
-        <w:t xml:space="preserve">Giao </w:t>
-      </w:r>
-      <w:r>
-        <w:rPr>
-          <w:lang w:val="vi-VN"/>
-        </w:rPr>
-        <w:t xml:space="preserve">đề tài </w:t>
-      </w:r>
-      <w:r>
-        <w:rPr>
-          <w:lang w:val="vi-VN"/>
-        </w:rPr>
-        <w:t xml:space="preserve">Khoa học công nghệ </w:t>
-      </w:r>
-      <w:r>
-        <w:rPr>
-          <w:lang w:val="vi-VN"/>
-        </w:rPr>
-        <w:t>năm</w:t>
-      </w:r>
-      <w:r>
-        <w:rPr>
-          <w:lang w:val="vi-VN"/>
-        </w:rPr>
-        <w:t xml:space="preserve"> </w:t>
-      </w:r>
-      <w:r>
-        <w:rPr>
-          <w:lang w:val="vi-VN"/>
-        </w:rPr>
-        <w:t>2024</w:t>
-      </w:r>
-      <w:r>
-        <w:rPr>
-          <w:lang w:val="vi-VN"/>
-        </w:rPr>
-        <w:t xml:space="preserve"> có tên</w:t>
-      </w:r>
-      <w:r>
-        <w:rPr>
-          <w:lang w:val="vi-VN"/>
-        </w:rPr>
-        <w:t>:</w:t>
-      </w:r>
-      <w:r>
-        <w:rPr>
-          <w:lang w:val="vi-VN"/>
-        </w:rPr>
-        <w:t xml:space="preserve"> </w:t>
-      </w:r>
-      <w:r>
-        <w:rPr>
-          <w:szCs w:val="26"/>
-          <w:lang w:val="vi-VN"/>
-        </w:rPr>
-        <w:t>“Đánh</w:t>
-      </w:r>
-      <w:r>
-        <w:rPr>
-          <w:szCs w:val="26"/>
-          <w:lang w:val="vi-VN"/>
-        </w:rPr>
-        <w:t xml:space="preserve"> giá hiệu quả sản phẩm sữa dinh dưỡng pha sẵn KUN </w:t>
-      </w:r>
-      <w:r>
-        <w:rPr>
-          <w:szCs w:val="26"/>
-          <w:lang w:val="vi-VN"/>
-        </w:rPr>
-        <w:t xml:space="preserve">DOCTOR COLOSTRUM </w:t>
-      </w:r>
-      <w:r>
-        <w:rPr>
-          <w:szCs w:val="26"/>
-          <w:lang w:val="vi-VN"/>
-        </w:rPr>
-        <w:t xml:space="preserve">lên tình trạng dinh dưỡng, </w:t>
-      </w:r>
-      <w:r>
-        <w:rPr>
-          <w:szCs w:val="26"/>
-          <w:lang w:val="vi-VN"/>
-        </w:rPr>
-        <w:t xml:space="preserve">miễn dịch, </w:t>
-      </w:r>
-      <w:r>
-        <w:rPr>
-          <w:szCs w:val="26"/>
-          <w:lang w:val="vi-VN"/>
-        </w:rPr>
-        <w:t>tiêu hóa</w:t>
-      </w:r>
-      <w:r>
-        <w:rPr>
-          <w:szCs w:val="26"/>
-          <w:lang w:val="vi-VN"/>
-        </w:rPr>
-        <w:t xml:space="preserve"> và giấc ngủ </w:t>
-      </w:r>
-      <w:r>
-        <w:rPr>
-          <w:szCs w:val="26"/>
-          <w:lang w:val="vi-VN"/>
-        </w:rPr>
-        <w:t xml:space="preserve">của trẻ từ 24 đến </w:t>
-      </w:r>
-      <w:r>
-        <w:rPr>
-          <w:szCs w:val="26"/>
-          <w:lang w:val="vi-VN"/>
-        </w:rPr>
-        <w:t>72</w:t>
-      </w:r>
-      <w:r>
-        <w:rPr>
-          <w:szCs w:val="26"/>
-          <w:lang w:val="vi-VN"/>
-        </w:rPr>
-        <w:t xml:space="preserve"> tháng tuổi</w:t>
-      </w:r>
-      <w:r>
-        <w:rPr>
-          <w:szCs w:val="26"/>
-          <w:lang w:val="vi-VN"/>
-        </w:rPr>
-        <w:t>”</w:t>
-      </w:r>
-      <w:r>
-        <w:rPr>
-          <w:szCs w:val="26"/>
-          <w:lang w:val="vi-VN"/>
-        </w:rPr>
-        <w:t xml:space="preserve"> cho các đơn vị triển khai</w:t>
-      </w:r>
-      <w:r>
-        <w:rPr>
-          <w:szCs w:val="26"/>
-          <w:lang w:val="vi-VN"/>
-        </w:rPr>
-        <w:t xml:space="preserve"> (có danh sách kèm theo).</w:t>
+        <w:t>Điều 1: Giao đề tài Khoa học công nghệ năm {{NAM}} có tên: “{{TEN_DE_TAI}}” cho các đơn vị triển khai (có danh sách kèm theo).</w:t>
+      </w:r>
+      <w:r>
+        <w:rPr>
+          <w:lang w:val="vi-VN"/>
+        </w:rPr>
+      </w:r>
+      <w:r>
+        <w:rPr>
+          <w:lang w:val="vi-VN"/>
+        </w:rPr>
+      </w:r>
+      <w:r>
+        <w:rPr>
+          <w:lang w:val="vi-VN"/>
+        </w:rPr>
+      </w:r>
+      <w:r>
+        <w:rPr>
+          <w:lang w:val="vi-VN"/>
+        </w:rPr>
+      </w:r>
+      <w:r>
+        <w:rPr>
+          <w:lang w:val="vi-VN"/>
+        </w:rPr>
+      </w:r>
+      <w:r>
+        <w:rPr>
+          <w:lang w:val="vi-VN"/>
+        </w:rPr>
+      </w:r>
+      <w:r>
+        <w:rPr>
+          <w:lang w:val="vi-VN"/>
+        </w:rPr>
+      </w:r>
+      <w:r>
+        <w:rPr>
+          <w:lang w:val="vi-VN"/>
+        </w:rPr>
+      </w:r>
+      <w:r>
+        <w:rPr>
+          <w:lang w:val="vi-VN"/>
+        </w:rPr>
+      </w:r>
+      <w:r>
+        <w:rPr>
+          <w:lang w:val="vi-VN"/>
+        </w:rPr>
+      </w:r>
+      <w:r>
+        <w:rPr>
+          <w:szCs w:val="26"/>
+          <w:lang w:val="vi-VN"/>
+        </w:rPr>
+      </w:r>
+      <w:r>
+        <w:rPr>
+          <w:szCs w:val="26"/>
+          <w:lang w:val="vi-VN"/>
+        </w:rPr>
+      </w:r>
+      <w:r>
+        <w:rPr>
+          <w:szCs w:val="26"/>
+          <w:lang w:val="vi-VN"/>
+        </w:rPr>
+      </w:r>
+      <w:r>
+        <w:rPr>
+          <w:szCs w:val="26"/>
+          <w:lang w:val="vi-VN"/>
+        </w:rPr>
+      </w:r>
+      <w:r>
+        <w:rPr>
+          <w:szCs w:val="26"/>
+          <w:lang w:val="vi-VN"/>
+        </w:rPr>
+      </w:r>
+      <w:r>
+        <w:rPr>
+          <w:szCs w:val="26"/>
+          <w:lang w:val="vi-VN"/>
+        </w:rPr>
+      </w:r>
+      <w:r>
+        <w:rPr>
+          <w:szCs w:val="26"/>
+          <w:lang w:val="vi-VN"/>
+        </w:rPr>
+      </w:r>
+      <w:r>
+        <w:rPr>
+          <w:szCs w:val="26"/>
+          <w:lang w:val="vi-VN"/>
+        </w:rPr>
+      </w:r>
+      <w:r>
+        <w:rPr>
+          <w:szCs w:val="26"/>
+          <w:lang w:val="vi-VN"/>
+        </w:rPr>
+      </w:r>
+      <w:r>
+        <w:rPr>
+          <w:szCs w:val="26"/>
+          <w:lang w:val="vi-VN"/>
+        </w:rPr>
+      </w:r>
+      <w:r>
+        <w:rPr>
+          <w:szCs w:val="26"/>
+          <w:lang w:val="vi-VN"/>
+        </w:rPr>
+      </w:r>
+      <w:r>
+        <w:rPr>
+          <w:szCs w:val="26"/>
+          <w:lang w:val="vi-VN"/>
+        </w:rPr>
+      </w:r>
+      <w:r>
+        <w:rPr>
+          <w:szCs w:val="26"/>
+          <w:lang w:val="vi-VN"/>
+        </w:rPr>
       </w:r>
     </w:p>
     <w:p>
@@ -1236,7 +1199,7 @@
           <w:iCs/>
           <w:lang w:val="vi-VN"/>
         </w:rPr>
-        <w:t>Đề tài</w:t>
+        <w:t>Đề tài: “{{TEN_DE_TAI}}”</w:t>
       </w:r>
       <w:r>
         <w:rPr>
@@ -1246,7 +1209,6 @@
           <w:iCs/>
           <w:lang w:val="vi-VN"/>
         </w:rPr>
-        <w:t>:</w:t>
       </w:r>
       <w:r>
         <w:rPr>
@@ -1254,7 +1216,6 @@
           <w:iCs/>
           <w:lang w:val="vi-VN"/>
         </w:rPr>
-        <w:t xml:space="preserve"> </w:t>
       </w:r>
       <w:r>
         <w:rPr>
@@ -1263,7 +1224,6 @@
           <w:szCs w:val="26"/>
           <w:lang w:val="vi-VN"/>
         </w:rPr>
-        <w:t>“Đánh giá hiệu quả sản phẩm sữa dinh dưỡng pha sẵn KUN DOCTOR COLOSTRUM lên tình trạng dinh dưỡng, miễn dịch, tiêu hóa và giấc ngủ của trẻ từ 24 đến 72 tháng tuổi”</w:t>
       </w:r>
     </w:p>
     <w:p>

</xml_diff>

<commit_message>
fix: migrate templates via Word COM backend to preserve run formatting, merge case-variant year entries, move DIA_DIEM period into master
</commit_message>
<xml_diff>
--- a/01. Hồ sơ đạo đức đề cương - MẪU/00. QĐ Giao đề tài.docx
+++ b/01. Hồ sơ đạo đức đề cương - MẪU/00. QĐ Giao đề tài.docx
@@ -186,7 +186,7 @@
                 <w:sz w:val="24"/>
                 <w:szCs w:val="24"/>
               </w:rPr>
-              <w:t>Số:     /QĐ-YHUD/{{NAM}}</w:t>
+              <w:t xml:space="preserve">Số: </w:t>
             </w:r>
             <w:r>
               <w:rPr>
@@ -194,12 +194,21 @@
                 <w:szCs w:val="24"/>
                 <w:lang w:val="vi-VN"/>
               </w:rPr>
+              <w:t xml:space="preserve">   </w:t>
             </w:r>
             <w:r>
               <w:rPr>
                 <w:sz w:val="24"/>
                 <w:szCs w:val="24"/>
               </w:rPr>
+              <w:t xml:space="preserve"> /QĐ-YHUD/</w:t>
+            </w:r>
+            <w:r>
+              <w:rPr>
+                <w:sz w:val="24"/>
+                <w:szCs w:val="24"/>
+              </w:rPr>
+              <w:t>{{NAM}}</w:t>
             </w:r>
           </w:p>
         </w:tc>
@@ -381,7 +390,7 @@
                 <w:sz w:val="24"/>
                 <w:szCs w:val="24"/>
               </w:rPr>
-              <w:t>Hà Nội, ngày      tháng      năm {{NAM}}</w:t>
+              <w:t>Hà Nội, ngày</w:t>
             </w:r>
             <w:r>
               <w:rPr>
@@ -390,6 +399,7 @@
                 <w:szCs w:val="24"/>
                 <w:lang w:val="vi-VN"/>
               </w:rPr>
+              <w:t xml:space="preserve">     </w:t>
             </w:r>
             <w:r>
               <w:rPr>
@@ -397,6 +407,7 @@
                 <w:sz w:val="24"/>
                 <w:szCs w:val="24"/>
               </w:rPr>
+              <w:t xml:space="preserve"> tháng </w:t>
             </w:r>
             <w:r>
               <w:rPr>
@@ -405,6 +416,7 @@
                 <w:szCs w:val="24"/>
                 <w:lang w:val="vi-VN"/>
               </w:rPr>
+              <w:t xml:space="preserve">     </w:t>
             </w:r>
             <w:r>
               <w:rPr>
@@ -412,6 +424,15 @@
                 <w:sz w:val="24"/>
                 <w:szCs w:val="24"/>
               </w:rPr>
+              <w:t xml:space="preserve">năm </w:t>
+            </w:r>
+            <w:r>
+              <w:rPr>
+                <w:i/>
+                <w:sz w:val="24"/>
+                <w:szCs w:val="24"/>
+              </w:rPr>
+              <w:t>{{NAM}}</w:t>
             </w:r>
           </w:p>
         </w:tc>
@@ -457,55 +478,63 @@
           <w:i/>
           <w:lang w:val="vi-VN"/>
         </w:rPr>
-        <w:t>V/v: Giao đề tài Khoa học công nghệ năm {{NAM}}</w:t>
-      </w:r>
-      <w:r>
-        <w:rPr>
-          <w:i/>
-          <w:lang w:val="vi-VN"/>
-        </w:rPr>
-      </w:r>
-      <w:r>
-        <w:rPr>
-          <w:i/>
-          <w:lang w:val="vi-VN"/>
-        </w:rPr>
-      </w:r>
-      <w:r>
-        <w:rPr>
-          <w:i/>
-          <w:lang w:val="vi-VN"/>
-        </w:rPr>
-      </w:r>
-      <w:r>
-        <w:rPr>
-          <w:i/>
-          <w:lang w:val="vi-VN"/>
-        </w:rPr>
-      </w:r>
-      <w:r>
-        <w:rPr>
-          <w:i/>
-          <w:lang w:val="vi-VN"/>
-        </w:rPr>
-      </w:r>
-      <w:r>
-        <w:rPr>
-          <w:i/>
-          <w:lang w:val="vi-VN"/>
-        </w:rPr>
-      </w:r>
-      <w:r>
-        <w:rPr>
-          <w:i/>
-          <w:lang w:val="vi-VN"/>
-        </w:rPr>
-      </w:r>
-      <w:r>
-        <w:rPr>
-          <w:i/>
-          <w:lang w:val="vi-VN"/>
-        </w:rPr>
+        <w:t>V</w:t>
+      </w:r>
+      <w:r>
+        <w:rPr>
+          <w:i/>
+          <w:lang w:val="vi-VN"/>
+        </w:rPr>
+        <w:t>/v</w:t>
+      </w:r>
+      <w:r>
+        <w:rPr>
+          <w:i/>
+          <w:lang w:val="vi-VN"/>
+        </w:rPr>
+        <w:t xml:space="preserve">: </w:t>
+      </w:r>
+      <w:r>
+        <w:rPr>
+          <w:i/>
+          <w:lang w:val="vi-VN"/>
+        </w:rPr>
+        <w:t xml:space="preserve">Giao </w:t>
+      </w:r>
+      <w:r>
+        <w:rPr>
+          <w:i/>
+          <w:lang w:val="vi-VN"/>
+        </w:rPr>
+        <w:t xml:space="preserve">đề tài </w:t>
+      </w:r>
+      <w:r>
+        <w:rPr>
+          <w:i/>
+          <w:lang w:val="vi-VN"/>
+        </w:rPr>
+        <w:t xml:space="preserve">Khoa học công nghệ </w:t>
+      </w:r>
+      <w:r>
+        <w:rPr>
+          <w:i/>
+          <w:lang w:val="vi-VN"/>
+        </w:rPr>
+        <w:t>năm</w:t>
+      </w:r>
+      <w:r>
+        <w:rPr>
+          <w:i/>
+          <w:lang w:val="vi-VN"/>
+        </w:rPr>
+        <w:t xml:space="preserve"> </w:t>
+      </w:r>
+      <w:r>
+        <w:rPr>
+          <w:i/>
+          <w:lang w:val="vi-VN"/>
+        </w:rPr>
+        <w:t>{{NAM}}</w:t>
       </w:r>
     </w:p>
     <w:p>
@@ -743,135 +772,102 @@
           <w:b/>
           <w:lang w:val="vi-VN"/>
         </w:rPr>
-        <w:t>Điều 1: Giao đề tài Khoa học công nghệ năm {{NAM}} có tên: “{{TEN_DE_TAI}}” cho các đơn vị triển khai (có danh sách kèm theo).</w:t>
-      </w:r>
-      <w:r>
-        <w:rPr>
-          <w:lang w:val="vi-VN"/>
-        </w:rPr>
-      </w:r>
-      <w:r>
-        <w:rPr>
-          <w:lang w:val="vi-VN"/>
-        </w:rPr>
-      </w:r>
-      <w:r>
-        <w:rPr>
-          <w:lang w:val="vi-VN"/>
-        </w:rPr>
-      </w:r>
-      <w:r>
-        <w:rPr>
-          <w:lang w:val="vi-VN"/>
-        </w:rPr>
-      </w:r>
-      <w:r>
-        <w:rPr>
-          <w:lang w:val="vi-VN"/>
-        </w:rPr>
-      </w:r>
-      <w:r>
-        <w:rPr>
-          <w:lang w:val="vi-VN"/>
-        </w:rPr>
-      </w:r>
-      <w:r>
-        <w:rPr>
-          <w:lang w:val="vi-VN"/>
-        </w:rPr>
-      </w:r>
-      <w:r>
-        <w:rPr>
-          <w:lang w:val="vi-VN"/>
-        </w:rPr>
-      </w:r>
-      <w:r>
-        <w:rPr>
-          <w:lang w:val="vi-VN"/>
-        </w:rPr>
-      </w:r>
-      <w:r>
-        <w:rPr>
-          <w:lang w:val="vi-VN"/>
-        </w:rPr>
+        <w:t>Điều 1</w:t>
+      </w:r>
+      <w:r>
+        <w:rPr>
+          <w:lang w:val="vi-VN"/>
+        </w:rPr>
+        <w:t xml:space="preserve">: </w:t>
+      </w:r>
+      <w:r>
+        <w:rPr>
+          <w:lang w:val="vi-VN"/>
+        </w:rPr>
+        <w:t xml:space="preserve">Giao </w:t>
+      </w:r>
+      <w:r>
+        <w:rPr>
+          <w:lang w:val="vi-VN"/>
+        </w:rPr>
+        <w:t xml:space="preserve">đề tài </w:t>
+      </w:r>
+      <w:r>
+        <w:rPr>
+          <w:lang w:val="vi-VN"/>
+        </w:rPr>
+        <w:t xml:space="preserve">Khoa học công nghệ </w:t>
+      </w:r>
+      <w:r>
+        <w:rPr>
+          <w:lang w:val="vi-VN"/>
+        </w:rPr>
+        <w:t>năm</w:t>
+      </w:r>
+      <w:r>
+        <w:rPr>
+          <w:lang w:val="vi-VN"/>
+        </w:rPr>
+        <w:t xml:space="preserve"> </w:t>
+      </w:r>
+      <w:r>
+        <w:rPr>
+          <w:lang w:val="vi-VN"/>
+        </w:rPr>
+        <w:t>{{NAM}}</w:t>
+      </w:r>
+      <w:r>
+        <w:rPr>
+          <w:lang w:val="vi-VN"/>
+        </w:rPr>
+        <w:t xml:space="preserve"> có tên</w:t>
+      </w:r>
+      <w:r>
+        <w:rPr>
+          <w:lang w:val="vi-VN"/>
+        </w:rPr>
+        <w:t>:</w:t>
+      </w:r>
+      <w:r>
+        <w:rPr>
+          <w:lang w:val="vi-VN"/>
+        </w:rPr>
+        <w:t xml:space="preserve"> </w:t>
       </w:r>
       <w:r>
         <w:rPr>
           <w:szCs w:val="26"/>
           <w:lang w:val="vi-VN"/>
         </w:rPr>
+        <w:t>“</w:t>
       </w:r>
       <w:r>
         <w:rPr>
           <w:szCs w:val="26"/>
           <w:lang w:val="vi-VN"/>
         </w:rPr>
+        <w:t>{{TEN_DE_TAI}}</w:t>
       </w:r>
       <w:r>
         <w:rPr>
           <w:szCs w:val="26"/>
           <w:lang w:val="vi-VN"/>
         </w:rPr>
+        <w:t>”</w:t>
       </w:r>
       <w:r>
         <w:rPr>
           <w:szCs w:val="26"/>
           <w:lang w:val="vi-VN"/>
         </w:rPr>
+        <w:t xml:space="preserve"> cho các đơn vị triển khai</w:t>
       </w:r>
       <w:r>
         <w:rPr>
           <w:szCs w:val="26"/>
           <w:lang w:val="vi-VN"/>
         </w:rPr>
-      </w:r>
-      <w:r>
-        <w:rPr>
-          <w:szCs w:val="26"/>
-          <w:lang w:val="vi-VN"/>
-        </w:rPr>
-      </w:r>
-      <w:r>
-        <w:rPr>
-          <w:szCs w:val="26"/>
-          <w:lang w:val="vi-VN"/>
-        </w:rPr>
-      </w:r>
-      <w:r>
-        <w:rPr>
-          <w:szCs w:val="26"/>
-          <w:lang w:val="vi-VN"/>
-        </w:rPr>
-      </w:r>
-      <w:r>
-        <w:rPr>
-          <w:szCs w:val="26"/>
-          <w:lang w:val="vi-VN"/>
-        </w:rPr>
-      </w:r>
-      <w:r>
-        <w:rPr>
-          <w:szCs w:val="26"/>
-          <w:lang w:val="vi-VN"/>
-        </w:rPr>
-      </w:r>
-      <w:r>
-        <w:rPr>
-          <w:szCs w:val="26"/>
-          <w:lang w:val="vi-VN"/>
-        </w:rPr>
-      </w:r>
-      <w:r>
-        <w:rPr>
-          <w:szCs w:val="26"/>
-          <w:lang w:val="vi-VN"/>
-        </w:rPr>
-      </w:r>
-      <w:r>
-        <w:rPr>
-          <w:szCs w:val="26"/>
-          <w:lang w:val="vi-VN"/>
-        </w:rPr>
+        <w:t xml:space="preserve"> (có danh sách kèm theo).</w:t>
       </w:r>
     </w:p>
     <w:p>
@@ -1199,7 +1195,7 @@
           <w:iCs/>
           <w:lang w:val="vi-VN"/>
         </w:rPr>
-        <w:t>Đề tài: “{{TEN_DE_TAI}}”</w:t>
+        <w:t>Đề tài</w:t>
       </w:r>
       <w:r>
         <w:rPr>
@@ -1209,6 +1205,7 @@
           <w:iCs/>
           <w:lang w:val="vi-VN"/>
         </w:rPr>
+        <w:t>:</w:t>
       </w:r>
       <w:r>
         <w:rPr>
@@ -1216,6 +1213,7 @@
           <w:iCs/>
           <w:lang w:val="vi-VN"/>
         </w:rPr>
+        <w:t xml:space="preserve"> </w:t>
       </w:r>
       <w:r>
         <w:rPr>
@@ -1224,6 +1222,25 @@
           <w:szCs w:val="26"/>
           <w:lang w:val="vi-VN"/>
         </w:rPr>
+        <w:t>“</w:t>
+      </w:r>
+      <w:r>
+        <w:rPr>
+          <w:i/>
+          <w:iCs/>
+          <w:szCs w:val="26"/>
+          <w:lang w:val="vi-VN"/>
+        </w:rPr>
+        <w:t>{{TEN_DE_TAI}}</w:t>
+      </w:r>
+      <w:r>
+        <w:rPr>
+          <w:i/>
+          <w:iCs/>
+          <w:szCs w:val="26"/>
+          <w:lang w:val="vi-VN"/>
+        </w:rPr>
+        <w:t>”</w:t>
       </w:r>
     </w:p>
     <w:p>

</xml_diff>

<commit_message>
refactor: migrate token configuration to JSON and update template directory structure
</commit_message>
<xml_diff>
--- a/01. Hồ sơ đạo đức đề cương - MẪU/00. QĐ Giao đề tài.docx
+++ b/01. Hồ sơ đạo đức đề cương - MẪU/00. QĐ Giao đề tài.docx
@@ -1164,7 +1164,6 @@
           <w:bCs/>
           <w:lang w:val="vi-VN"/>
         </w:rPr>
-        <w:lastRenderedPageBreak/>
         <w:t xml:space="preserve">DANH SÁCH ĐƠN VỊ TRIỂN KHAI ĐỀ </w:t>
       </w:r>
       <w:r>
@@ -1262,9 +1261,9 @@
         <w:tblLook w:val="04A0" w:firstRow="1" w:lastRow="0" w:firstColumn="1" w:lastColumn="0" w:noHBand="0" w:noVBand="1"/>
       </w:tblPr>
       <w:tblGrid>
-        <w:gridCol w:w="738"/>
-        <w:gridCol w:w="3060"/>
-        <w:gridCol w:w="5489"/>
+        <w:gridCol w:w="731"/>
+        <w:gridCol w:w="2629"/>
+        <w:gridCol w:w="5927"/>
       </w:tblGrid>
       <w:tr>
         <w:tc>
@@ -1398,7 +1397,7 @@
               <w:rPr>
                 <w:lang w:val="vi-VN"/>
               </w:rPr>
-              <w:t xml:space="preserve">Chủ nhiệm đề tài: </w:t>
+              <w:t>Chủ nhiệm đề tài:</w:t>
             </w:r>
           </w:p>
           <w:p>
@@ -1412,7 +1411,7 @@
               <w:rPr>
                 <w:lang w:val="vi-VN"/>
               </w:rPr>
-              <w:t>Tiến sỹ, Bác sỹ TRƯƠNG HỒNG SƠN - Viện trưởng Viện Y học ứng dụng Việt Nam.</w:t>
+              <w:t>{{CHU_NHIEM_HO_TEN}} - {{CHU_NHIEM_DON_VI}}.</w:t>
             </w:r>
           </w:p>
         </w:tc>
@@ -1454,7 +1453,13 @@
           </w:tcPr>
           <w:p>
             <w:pPr>
+              <w:widowControl w:val="0"/>
+              <w:numPr>
+                <w:ilvl w:val="0"/>
+                <w:numId w:val="4"/>
+              </w:numPr>
               <w:spacing w:before="120" w:after="0" w:line="360" w:lineRule="auto"/>
+              <w:contextualSpacing/>
               <w:rPr>
                 <w:lang w:val="vi-VN"/>
               </w:rPr>
@@ -1478,126 +1483,13 @@
               <w:rPr>
                 <w:rFonts w:cs="Times New Roman"/>
                 <w:szCs w:val="28"/>
-                <w:lang w:val="vi-VN"/>
               </w:rPr>
             </w:pPr>
             <w:r>
               <w:rPr>
-                <w:rFonts w:cs="Times New Roman"/>
-                <w:szCs w:val="28"/>
-                <w:lang w:val="vi-VN"/>
-              </w:rPr>
-              <w:t>Thạc sỹ LƯU LIÊN HƯƠNG</w:t>
-            </w:r>
-          </w:p>
-          <w:p>
-            <w:pPr>
-              <w:widowControl w:val="0"/>
-              <w:numPr>
-                <w:ilvl w:val="0"/>
-                <w:numId w:val="4"/>
-              </w:numPr>
-              <w:spacing w:before="120" w:after="0" w:line="360" w:lineRule="auto"/>
-              <w:contextualSpacing/>
-              <w:rPr>
-                <w:rFonts w:cs="Times New Roman"/>
-                <w:szCs w:val="28"/>
-              </w:rPr>
-            </w:pPr>
-            <w:r>
-              <w:rPr>
-                <w:rFonts w:cs="Times New Roman"/>
-                <w:szCs w:val="28"/>
-              </w:rPr>
-              <w:t>Thạc sỹ LÊ VIỆT ANH</w:t>
-            </w:r>
-          </w:p>
-          <w:p>
-            <w:pPr>
-              <w:widowControl w:val="0"/>
-              <w:numPr>
-                <w:ilvl w:val="0"/>
-                <w:numId w:val="4"/>
-              </w:numPr>
-              <w:spacing w:before="120" w:after="0" w:line="360" w:lineRule="auto"/>
-              <w:contextualSpacing/>
-              <w:rPr>
-                <w:rFonts w:cs="Times New Roman"/>
-                <w:szCs w:val="28"/>
-              </w:rPr>
-            </w:pPr>
-            <w:r>
-              <w:rPr>
-                <w:rFonts w:cs="Times New Roman"/>
-                <w:szCs w:val="28"/>
-              </w:rPr>
-              <w:t>Bác sỹ LÊ MINH KHÁNH</w:t>
-            </w:r>
-          </w:p>
-          <w:p>
-            <w:pPr>
-              <w:widowControl w:val="0"/>
-              <w:numPr>
-                <w:ilvl w:val="0"/>
-                <w:numId w:val="4"/>
-              </w:numPr>
-              <w:spacing w:before="120" w:after="0" w:line="360" w:lineRule="auto"/>
-              <w:contextualSpacing/>
-              <w:rPr>
-                <w:rFonts w:cs="Times New Roman"/>
-                <w:szCs w:val="28"/>
-              </w:rPr>
-            </w:pPr>
-            <w:r>
-              <w:rPr>
-                <w:rFonts w:cs="Times New Roman"/>
-                <w:szCs w:val="28"/>
-              </w:rPr>
-              <w:t>Cử nhân HOÀNG HÀ LINH</w:t>
-            </w:r>
-          </w:p>
-          <w:p>
-            <w:pPr>
-              <w:widowControl w:val="0"/>
-              <w:numPr>
-                <w:ilvl w:val="0"/>
-                <w:numId w:val="4"/>
-              </w:numPr>
-              <w:spacing w:before="120" w:after="0" w:line="360" w:lineRule="auto"/>
-              <w:contextualSpacing/>
-              <w:rPr>
-                <w:rFonts w:cs="Times New Roman"/>
-                <w:szCs w:val="28"/>
-              </w:rPr>
-            </w:pPr>
-            <w:r>
-              <w:rPr>
-                <w:rFonts w:cs="Times New Roman"/>
-                <w:szCs w:val="28"/>
-              </w:rPr>
-              <w:t>Cử nhân PHẠM HỒNG NGỌC</w:t>
-            </w:r>
-          </w:p>
-          <w:p>
-            <w:pPr>
-              <w:widowControl w:val="0"/>
-              <w:numPr>
-                <w:ilvl w:val="0"/>
-                <w:numId w:val="4"/>
-              </w:numPr>
-              <w:spacing w:before="120" w:after="0" w:line="360" w:lineRule="auto"/>
-              <w:contextualSpacing/>
-              <w:rPr>
-                <w:rFonts w:cs="Times New Roman"/>
-                <w:szCs w:val="28"/>
-              </w:rPr>
-            </w:pPr>
-            <w:r>
-              <w:rPr>
-                <w:rFonts w:cs="Times New Roman"/>
-                <w:szCs w:val="28"/>
-              </w:rPr>
-              <w:t>Cử nhân TRƯƠNG PHAN HỒNG HÀ</w:t>
+                <w:lang w:val="vi-VN"/>
+              </w:rPr>
+              <w:t>{{DANH_SACH_NGHIEN_CUU_VIEN}}</w:t>
             </w:r>
           </w:p>
         </w:tc>

</xml_diff>